<commit_message>
CSCU-only: sweep all docs after the AWC removal; diagrams + docx rebuilt
Follows the 'remove AWC' commit: every remaining AWC reference is gone
from the living docs (root README, data_sources/courseware indexes, lab
README/compose/loader, GUIDE, INSTALL, MANIFEST, REFERENCE, SUPPLEMENT,
domain-pack README) — changelog history preserved. The shared lab and the
scenario plug-in model are unchanged; a Retail scenario is planned next
and drops in as data_sources/<ID>/ + courseware/<ID>/.

New: data_sources/lab/diagrams/ (lab-topology + shared-lab, PNG + SVG,
CSCU + extensible-scenario ghosts) and lab-setup.docx rebuilt CSCU-only
for PDC 11.0.0 with both diagrams embedded and the git clone/pull steps.
VERSION -> 1.7.2.

Co-Authored-By: Claude Fable 5 <noreply@anthropic.com>
</commit_message>
<xml_diff>
--- a/data_sources/lab/lab-setup.docx
+++ b/data_sources/lab/lab-setup.docx
@@ -20,12 +20,12 @@
     </w:p>
     <w:p>
       <w:r>
-        <w:t xml:space="preserve">Shared demo lab — one PostgreSQL + one MinIO for every scenario (AWC · CSCU)</w:t>
-      </w:r>
-    </w:p>
-    <w:p>
-      <w:r>
-        <w:t xml:space="preserve">Everything an instructor or learner needs to stand up the shared lab, load a scenario (Copper State Credit Union or Arizona Water Company), and connect both data sources to Pentaho Data Catalog before Workshop 1. Clone the repository, run make up, load a scenario — done.</w:t>
+        <w:t xml:space="preserve">Shared demo lab — one PostgreSQL + one MinIO · Copper State Credit Union scenario</w:t>
+      </w:r>
+    </w:p>
+    <w:p>
+      <w:r>
+        <w:t xml:space="preserve">Everything an instructor or learner needs to stand up the shared lab, load the Copper State Credit Union (CSCU) scenario, and connect both data sources to Pentaho Data Catalog before Workshop 1. Clone the repository, run make up, load the scenario — done.</w:t>
       </w:r>
     </w:p>
     <w:p>
@@ -38,7 +38,45 @@
     </w:p>
     <w:p>
       <w:r>
-        <w:t xml:space="preserve">This guide prepares the lab environment for the Business Analyst course. The lab is a single, shared Docker stack: one PostgreSQL 16 container (demo-postgres) and one MinIO object store (demo-minio). Each training scenario loads into its own database and its own bucket, so scenarios coexist side by side with no port conflicts, and switching or combining them never requires a different stack. A provided Makefile brings the stack up, and a loader script creates, populates and verifies each scenario on demand.</w:t>
+        <w:t xml:space="preserve">This guide prepares the lab environment for the Business Analyst course. The lab is a single, shared Docker stack: one PostgreSQL 16 container (demo-postgres) and one MinIO object store (demo-minio). Each training scenario loads into its own database and its own bucket — the current course scenario is Copper State Credit Union (CSCU), and any future scenario coexists beside it with no port conflicts. A provided Makefile brings the stack up, and a loader script creates, populates and verifies each scenario on demand.</w:t>
+      </w:r>
+    </w:p>
+    <w:p>
+      <w:pPr>
+        <w:jc w:val="center"/>
+      </w:pPr>
+      <w:r>
+        <w:drawing>
+          <wp:inline xmlns:wp="http://schemas.openxmlformats.org/drawingml/2006/wordprocessingDrawing" distT="0" distB="0" distL="0" distR="0">
+            <wp:extent cx="5760720" cy="3052343"/>
+            <wp:docPr id="101" name="shared-lab"/>
+            <a:graphic xmlns:a="http://schemas.openxmlformats.org/drawingml/2006/main">
+              <a:graphicData uri="http://schemas.openxmlformats.org/drawingml/2006/picture">
+                <pic:pic xmlns:pic="http://schemas.openxmlformats.org/drawingml/2006/picture">
+                  <pic:nvPicPr>
+                    <pic:cNvPr id="101" name="shared-lab"/>
+                    <pic:cNvPicPr/>
+                  </pic:nvPicPr>
+                  <pic:blipFill>
+                    <a:blip r:embed="rId101"/>
+                    <a:stretch>
+                      <a:fillRect/>
+                    </a:stretch>
+                  </pic:blipFill>
+                  <pic:spPr>
+                    <a:xfrm>
+                      <a:off x="0" y="0"/>
+                      <a:ext cx="5760720" cy="3052343"/>
+                    </a:xfrm>
+                    <a:prstGeom prst="rect">
+                      <a:avLst/>
+                    </a:prstGeom>
+                  </pic:spPr>
+                </pic:pic>
+              </a:graphicData>
+            </a:graphic>
+          </wp:inline>
+        </w:drawing>
       </w:r>
     </w:p>
     <w:p>
@@ -58,7 +96,7 @@
         </w:numPr>
       </w:pPr>
       <w:r>
-        <w:t xml:space="preserve">A PostgreSQL 16 container (demo-postgres) hosting one database per scenario — cscu_core (11 tables, Copper State Credit Union) and/or awc_operations (6 tables, Arizona Water Company) — published on host port 5433.</w:t>
+        <w:t xml:space="preserve">A PostgreSQL 16 container (demo-postgres) hosting one database per scenario — cscu_core (11 tables, Copper State Credit Union) — published on host port 5433.</w:t>
       </w:r>
     </w:p>
     <w:p>
@@ -70,7 +108,7 @@
         </w:numPr>
       </w:pPr>
       <w:r>
-        <w:t xml:space="preserve">A MinIO object store (demo-minio) hosting one bucket per scenario — cscu-documents (18 files) and/or awc-documents (17 files) — S3 API on port 9000, web console on 9001.</w:t>
+        <w:t xml:space="preserve">A MinIO object store (demo-minio) hosting one bucket per scenario — cscu-documents (18 files) — S3 API on port 9000, web console on 9001.</w:t>
       </w:r>
     </w:p>
     <w:p>
@@ -82,7 +120,7 @@
         </w:numPr>
       </w:pPr>
       <w:r>
-        <w:t xml:space="preserve">Read-only catalog users PDC connects with: pdc_user for the databases, and cscu_minio_user / awc_minio_user for the buckets.</w:t>
+        <w:t xml:space="preserve">Read-only catalog users PDC connects with: pdc_user for the database and cscu_minio_user for the bucket.</w:t>
       </w:r>
     </w:p>
     <w:p>
@@ -94,7 +132,7 @@
         </w:numPr>
       </w:pPr>
       <w:r>
-        <w:t xml:space="preserve">Verified PDC data sources per scenario — e.g. CopperState_Core_Banking and CopperState_Documents for CSCU.</w:t>
+        <w:t xml:space="preserve">Two verified PDC data sources — CopperState_Core_Banking and CopperState_Documents.</w:t>
       </w:r>
     </w:p>
     <w:p>
@@ -163,7 +201,7 @@
     </w:p>
     <w:p>
       <w:r>
-        <w:t xml:space="preserve">The lab ships inside the PDC-Glossary-Generator git repository, together with the scenario data, the domain packs, the Glossary Generator app and the courseware. Clone it once on the Docker host (the Ubuntu VM):</w:t>
+        <w:t xml:space="preserve">The lab ships inside the PDC-Glossary-Generator git repository, together with the scenario data, the domain pack, the Glossary Generator app and the courseware. Clone it once on the Docker host (the Ubuntu VM):</w:t>
       </w:r>
     </w:p>
     <w:p>
@@ -248,7 +286,7 @@
         </w:numPr>
       </w:pPr>
       <w:r>
-        <w:t xml:space="preserve">data_sources/CSCU/ and data_sources/AWC/ — scenario data only: the sample SQL, the documents, the installable domain pack and the PDC bulk-load CSV.</w:t>
+        <w:t xml:space="preserve">data_sources/CSCU/ — scenario data only: the sample SQL, the documents, the installable domain pack and the PDC bulk-load CSV.</w:t>
       </w:r>
     </w:p>
     <w:p>
@@ -260,7 +298,7 @@
         </w:numPr>
       </w:pPr>
       <w:r>
-        <w:t xml:space="preserve">courseware/CSCU/ and courseware/AWC/ — the workshop guides and assets for each scenario.</w:t>
+        <w:t xml:space="preserve">courseware/CSCU/ — the workshop guides and assets for the scenario.</w:t>
       </w:r>
     </w:p>
     <w:p>
@@ -268,7 +306,7 @@
         <w:pStyle w:val="Heading1"/>
       </w:pPr>
       <w:r>
-        <w:t xml:space="preserve">Part B — Stand up the lab and load a scenario</w:t>
+        <w:t xml:space="preserve">Part B — Stand up the lab and load the scenario</w:t>
       </w:r>
     </w:p>
     <w:p>
@@ -313,7 +351,7 @@
         <w:pStyle w:val="Heading2"/>
       </w:pPr>
       <w:r>
-        <w:t xml:space="preserve">Step 2: Load a scenario</w:t>
+        <w:t xml:space="preserve">Step 2: Load the scenario</w:t>
       </w:r>
     </w:p>
     <w:p>
@@ -329,18 +367,6 @@
       </w:r>
     </w:p>
     <w:p>
-      <w:pPr>
-        <w:shd w:val="clear" w:color="auto" w:fill="F2F2F2"/>
-      </w:pPr>
-      <w:r>
-        <w:rPr>
-          <w:rFonts w:ascii="Consolas" w:hAnsi="Consolas"/>
-          <w:sz w:val="20"/>
-        </w:rPr>
-        <w:t xml:space="preserve">make load SCENARIO=AWC        # optional — the scenarios coexist</w:t>
-      </w:r>
-    </w:p>
-    <w:p>
       <w:r>
         <w:t xml:space="preserve">For the selected scenario the loader:</w:t>
       </w:r>
@@ -354,7 +380,7 @@
         </w:numPr>
       </w:pPr>
       <w:r>
-        <w:t xml:space="preserve">creates the scenario's database (cscu_core or awc_operations) and runs its SQL in order — schema, tables, sample data, then the read-only pdc_user grants;</w:t>
+        <w:t xml:space="preserve">creates the scenario's database (cscu_core) and runs its SQL in order — schema, tables, sample data, then the read-only pdc_user grants;</w:t>
       </w:r>
     </w:p>
     <w:p>
@@ -366,7 +392,7 @@
         </w:numPr>
       </w:pPr>
       <w:r>
-        <w:t xml:space="preserve">creates the scenario's bucket (cscu-documents or awc-documents), its read-only MinIO user and a bucket-scoped read-only policy;</w:t>
+        <w:t xml:space="preserve">creates the scenario's bucket (cscu-documents), its read-only MinIO user and a bucket-scoped read-only policy;</w:t>
       </w:r>
     </w:p>
     <w:p>
@@ -408,7 +434,7 @@
     </w:p>
     <w:p>
       <w:r>
-        <w:t xml:space="preserve">Each load ends with a summary line naming the database, schema and bucket it created and verified. Reprint the PDC connection details for every scenario — with a LOADED / not loaded state — at any time with:</w:t>
+        <w:t xml:space="preserve">Each load ends with a summary line naming the database, schema and bucket it created and verified. Reprint the PDC connection details — with a LOADED / not loaded state per scenario — at any time with:</w:t>
       </w:r>
     </w:p>
     <w:p>
@@ -708,7 +734,45 @@
     </w:p>
     <w:p>
       <w:r>
-        <w:t xml:space="preserve">Always use the VM's IP address (192.168.1.200) for the data-source connections; reserve pentaho.io for PDC's own HTTPS URL. Container names such as demo-postgres resolve only inside the VM's Docker network, and the IP endpoint also forces the S3 path-style addressing that MinIO requires. These are the exact values printed by make console, and the same ones pre-filled in each scenario's bulk-load CSV (data_sources/&lt;ID&gt;/*-datasources.csv).</w:t>
+        <w:t xml:space="preserve">Always use the VM's IP address (192.168.1.200) for the data-source connections; reserve pentaho.io for PDC's own HTTPS URL. Container names such as demo-postgres resolve only inside the VM's Docker network, and the IP endpoint also forces the S3 path-style addressing that MinIO requires. These are the exact values printed by make console, and the same ones pre-filled in the scenario's bulk-load CSV (data_sources/CSCU/cscu-datasources.csv).</w:t>
+      </w:r>
+    </w:p>
+    <w:p>
+      <w:pPr>
+        <w:jc w:val="center"/>
+      </w:pPr>
+      <w:r>
+        <w:drawing>
+          <wp:inline xmlns:wp="http://schemas.openxmlformats.org/drawingml/2006/wordprocessingDrawing" distT="0" distB="0" distL="0" distR="0">
+            <wp:extent cx="5760720" cy="3231552"/>
+            <wp:docPr id="102" name="lab-topology"/>
+            <a:graphic xmlns:a="http://schemas.openxmlformats.org/drawingml/2006/main">
+              <a:graphicData uri="http://schemas.openxmlformats.org/drawingml/2006/picture">
+                <pic:pic xmlns:pic="http://schemas.openxmlformats.org/drawingml/2006/picture">
+                  <pic:nvPicPr>
+                    <pic:cNvPr id="102" name="lab-topology"/>
+                    <pic:cNvPicPr/>
+                  </pic:nvPicPr>
+                  <pic:blipFill>
+                    <a:blip r:embed="rId102"/>
+                    <a:stretch>
+                      <a:fillRect/>
+                    </a:stretch>
+                  </pic:blipFill>
+                  <pic:spPr>
+                    <a:xfrm>
+                      <a:off x="0" y="0"/>
+                      <a:ext cx="5760720" cy="3231552"/>
+                    </a:xfrm>
+                    <a:prstGeom prst="rect">
+                      <a:avLst/>
+                    </a:prstGeom>
+                  </pic:spPr>
+                </pic:pic>
+              </a:graphicData>
+            </a:graphic>
+          </wp:inline>
+        </w:drawing>
       </w:r>
     </w:p>
     <w:p>
@@ -716,7 +780,7 @@
         <w:pStyle w:val="Heading2"/>
       </w:pPr>
       <w:r>
-        <w:t xml:space="preserve">CSCU — the database source</w:t>
+        <w:t xml:space="preserve">The database source</w:t>
       </w:r>
     </w:p>
     <w:tbl>
@@ -1030,7 +1094,7 @@
         <w:pStyle w:val="Heading2"/>
       </w:pPr>
       <w:r>
-        <w:t xml:space="preserve">CSCU — the object-store source</w:t>
+        <w:t xml:space="preserve">The object-store source</w:t>
       </w:r>
     </w:p>
     <w:tbl>
@@ -1266,12 +1330,12 @@
         <w:pStyle w:val="Heading2"/>
       </w:pPr>
       <w:r>
-        <w:t xml:space="preserve">AWC — the same pattern</w:t>
-      </w:r>
-    </w:p>
-    <w:p>
-      <w:r>
-        <w:t xml:space="preserve">The Arizona Water Company scenario connects identically — only the names change: database source Arizona_Water_Operations (database awc_operations, schema awc_operations, same host 192.168.1.200, port 5433, user pdc_user), and object store Arizona_Water_Documents (same endpoint, access key awc_minio_user, bucket awc-documents).</w:t>
+        <w:t xml:space="preserve">Future scenarios — the same pattern</w:t>
+      </w:r>
+    </w:p>
+    <w:p>
+      <w:r>
+        <w:t xml:space="preserve">Any additional scenario dropped under data_sources/&lt;ID&gt;/ (with a scenario.json) connects identically — only the database, bucket and resource names change; the host, port and endpoint stay the same.</w:t>
       </w:r>
     </w:p>
     <w:p>
@@ -1291,7 +1355,7 @@
         </w:numPr>
       </w:pPr>
       <w:r>
-        <w:t xml:space="preserve">Database: Test Connection succeeds, Metadata Ingest lists the scenario schema, and the tables appear in the Data Canvas.</w:t>
+        <w:t xml:space="preserve">Database: Test Connection succeeds, Metadata Ingest lists the cscu_core schema, and the 11 tables appear in the Data Canvas.</w:t>
       </w:r>
     </w:p>
     <w:p>
@@ -1320,7 +1384,7 @@
     </w:p>
     <w:p>
       <w:r>
-        <w:t xml:space="preserve">All scenario data — Arizona Water Company and Copper State Credit Union — is fictional and generated for training. Lab credentials are training values; change them for anything beyond the lab.</w:t>
+        <w:t xml:space="preserve">All Copper State Credit Union data is fictional and generated for training. Lab credentials are training values; change them for anything beyond the lab.</w:t>
       </w:r>
     </w:p>
     <w:sectPr>
@@ -1389,7 +1453,7 @@
         <w:sz w:val="16"/>
         <w:szCs w:val="16"/>
       </w:rPr>
-      <w:t xml:space="preserve">Shared Demo Lab (AWC · CSCU)  ·  Page </w:t>
+      <w:t xml:space="preserve">Shared Demo Lab (CSCU)  ·  Page </w:t>
     </w:r>
     <w:r>
       <w:rPr>

</xml_diff>

<commit_message>
Lab setup + troubleshooting: PDC platform issues, four-scenario refresh
- lab-setup.docx rebuilt: covers all four scenarios (per-scenario db/
  bucket/user tables, CSCU kept as the worked example) and gains a
  'Troubleshooting - PDC itself won't come up' section with the
  opensearch-cluster-init cert fix and the pentaho.io HSTS/cert browser
  warning (thisisunsafe bypass); footer updated. Word COM QA OK.
- docs/PDC-VM-TROUBLESHOOTING.md: new section for the browser
  NET::ERR_CERT_AUTHORITY_INVALID error - HSTS-suppressed proceed link,
  the thisisunsafe bypass, and the clean cert-import path (openssl
  s_client capture of the proxy cert, update-ca-certificates, Chrome
  authority import), with the rebuild-regenerates-the-cert caveat.
- data_sources/lab/README.md: pointer note upgraded to a proper
  troubleshooting section summarizing both known PDC issues.

Co-Authored-By: Claude Fable 5 <noreply@anthropic.com>
</commit_message>
<xml_diff>
--- a/data_sources/lab/lab-setup.docx
+++ b/data_sources/lab/lab-setup.docx
@@ -20,12 +20,12 @@
     </w:p>
     <w:p>
       <w:r>
-        <w:t xml:space="preserve">Shared demo lab — one PostgreSQL + one MinIO · Copper State Credit Union scenario</w:t>
-      </w:r>
-    </w:p>
-    <w:p>
-      <w:r>
-        <w:t xml:space="preserve">Everything an instructor or learner needs to stand up the shared lab, load the Copper State Credit Union (CSCU) scenario, and connect both data sources to Pentaho Data Catalog before Workshop 1. Clone the repository, run make up, load the scenario — done.</w:t>
+        <w:t xml:space="preserve">Shared demo lab — one PostgreSQL + one MinIO · four scenarios: CSCU · RETAIL · HEALTH · MFG</w:t>
+      </w:r>
+    </w:p>
+    <w:p>
+      <w:r>
+        <w:t xml:space="preserve">Everything an instructor or learner needs to stand up the shared lab, load a training scenario, and connect both data sources to Pentaho Data Catalog before Workshop 1. Clone the repository, run make up, load the scenario — done. The same steps serve all four scenarios; CSCU is used as the worked example throughout.</w:t>
       </w:r>
     </w:p>
     <w:p>
@@ -38,7 +38,7 @@
     </w:p>
     <w:p>
       <w:r>
-        <w:t xml:space="preserve">This guide prepares the lab environment for the Business Analyst course. The lab is a single, shared Docker stack: one PostgreSQL 16 container (demo-postgres) and one MinIO object store (demo-minio). Each training scenario loads into its own database and its own bucket — the current course scenario is Copper State Credit Union (CSCU), and any future scenario coexists beside it with no port conflicts. A provided Makefile brings the stack up, and a loader script creates, populates and verifies each scenario on demand.</w:t>
+        <w:t xml:space="preserve">This guide prepares the lab environment for the Business Analyst course. The lab is a single, shared Docker stack: one PostgreSQL 16 container (demo-postgres) and one MinIO object store (demo-minio). Each training scenario loads into its own database and its own bucket, so the four course scenarios — CSCU (Copper State Credit Union, financial), RETAIL (Canyon Trail Outfitters), HEALTH (Lakeshore Health Partners) and MFG (Cascade Precision Components) — coexist side by side with no port conflicts. A provided Makefile brings the stack up, and a loader script creates, populates and verifies each scenario on demand.</w:t>
       </w:r>
     </w:p>
     <w:p>
@@ -96,7 +96,7 @@
         </w:numPr>
       </w:pPr>
       <w:r>
-        <w:t xml:space="preserve">A PostgreSQL 16 container (demo-postgres) hosting one database per scenario — cscu_core (11 tables, Copper State Credit Union) — published on host port 5433.</w:t>
+        <w:t xml:space="preserve">A PostgreSQL 16 container (demo-postgres) hosting one database per scenario (11 tables each), published on host port 5433.</w:t>
       </w:r>
     </w:p>
     <w:p>
@@ -108,7 +108,7 @@
         </w:numPr>
       </w:pPr>
       <w:r>
-        <w:t xml:space="preserve">A MinIO object store (demo-minio) hosting one bucket per scenario — cscu-documents (18 files) — S3 API on port 9000, web console on 9001.</w:t>
+        <w:t xml:space="preserve">A MinIO object store (demo-minio) hosting one bucket per scenario (18 files each) — S3 API on port 9000, web console on 9001.</w:t>
       </w:r>
     </w:p>
     <w:p>
@@ -120,7 +120,7 @@
         </w:numPr>
       </w:pPr>
       <w:r>
-        <w:t xml:space="preserve">Read-only catalog users PDC connects with: pdc_user for the database and cscu_minio_user for the bucket.</w:t>
+        <w:t xml:space="preserve">Read-only catalog users PDC connects with: pdc_user for every database, plus a per-scenario MinIO user for each bucket.</w:t>
       </w:r>
     </w:p>
     <w:p>
@@ -132,9 +132,267 @@
         </w:numPr>
       </w:pPr>
       <w:r>
-        <w:t xml:space="preserve">Two verified PDC data sources — CopperState_Core_Banking and CopperState_Documents.</w:t>
-      </w:r>
-    </w:p>
+        <w:t xml:space="preserve">Two verified PDC data sources per loaded scenario — a database and a document store.</w:t>
+      </w:r>
+    </w:p>
+    <w:tbl>
+      <w:tblPr>
+        <w:tblW w:w="0" w:type="auto"/>
+        <w:tblBorders>
+          <w:top w:val="single" w:sz="4" w:space="0" w:color="BFBFBF"/>
+          <w:left w:val="single" w:sz="4" w:space="0" w:color="BFBFBF"/>
+          <w:bottom w:val="single" w:sz="4" w:space="0" w:color="BFBFBF"/>
+          <w:right w:val="single" w:sz="4" w:space="0" w:color="BFBFBF"/>
+          <w:insideH w:val="single" w:sz="4" w:space="0" w:color="BFBFBF"/>
+          <w:insideV w:val="single" w:sz="4" w:space="0" w:color="BFBFBF"/>
+        </w:tblBorders>
+      </w:tblPr>
+      <w:tblGrid>
+        <w:gridCol w:w="1700"/>
+        <w:gridCol w:w="2500"/>
+        <w:gridCol w:w="2700"/>
+        <w:gridCol w:w="2460"/>
+      </w:tblGrid>
+      <w:tr>
+        <w:tc>
+          <w:tcPr>
+            <w:tcW w:w="1700" w:type="dxa"/>
+          </w:tcPr>
+          <w:p>
+            <w:r>
+              <w:rPr>
+                <w:b/>
+              </w:rPr>
+              <w:t xml:space="preserve">Scenario</w:t>
+            </w:r>
+          </w:p>
+        </w:tc>
+        <w:tc>
+          <w:tcPr>
+            <w:tcW w:w="2500" w:type="dxa"/>
+          </w:tcPr>
+          <w:p>
+            <w:r>
+              <w:rPr>
+                <w:b/>
+              </w:rPr>
+              <w:t xml:space="preserve">Database</w:t>
+            </w:r>
+          </w:p>
+        </w:tc>
+        <w:tc>
+          <w:tcPr>
+            <w:tcW w:w="2700" w:type="dxa"/>
+          </w:tcPr>
+          <w:p>
+            <w:r>
+              <w:rPr>
+                <w:b/>
+              </w:rPr>
+              <w:t xml:space="preserve">Bucket</w:t>
+            </w:r>
+          </w:p>
+        </w:tc>
+        <w:tc>
+          <w:tcPr>
+            <w:tcW w:w="2460" w:type="dxa"/>
+          </w:tcPr>
+          <w:p>
+            <w:r>
+              <w:rPr>
+                <w:b/>
+              </w:rPr>
+              <w:t xml:space="preserve">MinIO user</w:t>
+            </w:r>
+          </w:p>
+        </w:tc>
+      </w:tr>
+      <w:tr>
+        <w:tc>
+          <w:tcPr>
+            <w:tcW w:w="1700" w:type="dxa"/>
+          </w:tcPr>
+          <w:p>
+            <w:r>
+              <w:t xml:space="preserve">CSCU</w:t>
+            </w:r>
+          </w:p>
+        </w:tc>
+        <w:tc>
+          <w:tcPr>
+            <w:tcW w:w="2500" w:type="dxa"/>
+          </w:tcPr>
+          <w:p>
+            <w:r>
+              <w:rPr>
+                <w:rFonts w:ascii="Consolas" w:hAnsi="Consolas"/>
+                <w:sz w:val="20"/>
+              </w:rPr>
+              <w:t xml:space="preserve">cscu_core</w:t>
+            </w:r>
+          </w:p>
+        </w:tc>
+        <w:tc>
+          <w:tcPr>
+            <w:tcW w:w="2700" w:type="dxa"/>
+          </w:tcPr>
+          <w:p>
+            <w:r>
+              <w:t xml:space="preserve">cscu-documents</w:t>
+            </w:r>
+          </w:p>
+        </w:tc>
+        <w:tc>
+          <w:tcPr>
+            <w:tcW w:w="2460" w:type="dxa"/>
+          </w:tcPr>
+          <w:p>
+            <w:r>
+              <w:t xml:space="preserve">cscu_minio_user</w:t>
+            </w:r>
+          </w:p>
+        </w:tc>
+      </w:tr>
+      <w:tr>
+        <w:tc>
+          <w:tcPr>
+            <w:tcW w:w="1700" w:type="dxa"/>
+          </w:tcPr>
+          <w:p>
+            <w:r>
+              <w:t xml:space="preserve">RETAIL</w:t>
+            </w:r>
+          </w:p>
+        </w:tc>
+        <w:tc>
+          <w:tcPr>
+            <w:tcW w:w="2500" w:type="dxa"/>
+          </w:tcPr>
+          <w:p>
+            <w:r>
+              <w:rPr>
+                <w:rFonts w:ascii="Consolas" w:hAnsi="Consolas"/>
+                <w:sz w:val="20"/>
+              </w:rPr>
+              <w:t xml:space="preserve">cto_retail</w:t>
+            </w:r>
+          </w:p>
+        </w:tc>
+        <w:tc>
+          <w:tcPr>
+            <w:tcW w:w="2700" w:type="dxa"/>
+          </w:tcPr>
+          <w:p>
+            <w:r>
+              <w:t xml:space="preserve">cto-documents</w:t>
+            </w:r>
+          </w:p>
+        </w:tc>
+        <w:tc>
+          <w:tcPr>
+            <w:tcW w:w="2460" w:type="dxa"/>
+          </w:tcPr>
+          <w:p>
+            <w:r>
+              <w:t xml:space="preserve">cto_minio_user</w:t>
+            </w:r>
+          </w:p>
+        </w:tc>
+      </w:tr>
+      <w:tr>
+        <w:tc>
+          <w:tcPr>
+            <w:tcW w:w="1700" w:type="dxa"/>
+          </w:tcPr>
+          <w:p>
+            <w:r>
+              <w:t xml:space="preserve">HEALTH</w:t>
+            </w:r>
+          </w:p>
+        </w:tc>
+        <w:tc>
+          <w:tcPr>
+            <w:tcW w:w="2500" w:type="dxa"/>
+          </w:tcPr>
+          <w:p>
+            <w:r>
+              <w:rPr>
+                <w:rFonts w:ascii="Consolas" w:hAnsi="Consolas"/>
+                <w:sz w:val="20"/>
+              </w:rPr>
+              <w:t xml:space="preserve">lhp_clinical</w:t>
+            </w:r>
+          </w:p>
+        </w:tc>
+        <w:tc>
+          <w:tcPr>
+            <w:tcW w:w="2700" w:type="dxa"/>
+          </w:tcPr>
+          <w:p>
+            <w:r>
+              <w:t xml:space="preserve">lhp-documents</w:t>
+            </w:r>
+          </w:p>
+        </w:tc>
+        <w:tc>
+          <w:tcPr>
+            <w:tcW w:w="2460" w:type="dxa"/>
+          </w:tcPr>
+          <w:p>
+            <w:r>
+              <w:t xml:space="preserve">lhp_minio_user</w:t>
+            </w:r>
+          </w:p>
+        </w:tc>
+      </w:tr>
+      <w:tr>
+        <w:tc>
+          <w:tcPr>
+            <w:tcW w:w="1700" w:type="dxa"/>
+          </w:tcPr>
+          <w:p>
+            <w:r>
+              <w:t xml:space="preserve">MFG</w:t>
+            </w:r>
+          </w:p>
+        </w:tc>
+        <w:tc>
+          <w:tcPr>
+            <w:tcW w:w="2500" w:type="dxa"/>
+          </w:tcPr>
+          <w:p>
+            <w:r>
+              <w:rPr>
+                <w:rFonts w:ascii="Consolas" w:hAnsi="Consolas"/>
+                <w:sz w:val="20"/>
+              </w:rPr>
+              <w:t xml:space="preserve">cpc_mfg</w:t>
+            </w:r>
+          </w:p>
+        </w:tc>
+        <w:tc>
+          <w:tcPr>
+            <w:tcW w:w="2700" w:type="dxa"/>
+          </w:tcPr>
+          <w:p>
+            <w:r>
+              <w:t xml:space="preserve">cpc-documents</w:t>
+            </w:r>
+          </w:p>
+        </w:tc>
+        <w:tc>
+          <w:tcPr>
+            <w:tcW w:w="2460" w:type="dxa"/>
+          </w:tcPr>
+          <w:p>
+            <w:r>
+              <w:t xml:space="preserve">cpc_minio_user</w:t>
+            </w:r>
+          </w:p>
+        </w:tc>
+      </w:tr>
+    </w:tbl>
+    <w:p/>
     <w:p>
       <w:pPr>
         <w:pStyle w:val="Heading1"/>
@@ -286,7 +544,7 @@
         </w:numPr>
       </w:pPr>
       <w:r>
-        <w:t xml:space="preserve">data_sources/CSCU/ — scenario data only: the sample SQL, the documents, the installable domain pack and the PDC bulk-load CSV.</w:t>
+        <w:t xml:space="preserve">data_sources/&lt;ID&gt;/ — one data folder per scenario (CSCU, RETAIL, HEALTH, MFG): the sample SQL, the documents, the installable domain pack and the PDC bulk-load CSV.</w:t>
       </w:r>
     </w:p>
     <w:p>
@@ -298,7 +556,7 @@
         </w:numPr>
       </w:pPr>
       <w:r>
-        <w:t xml:space="preserve">courseware/CSCU/ — the workshop guides and assets for the scenario.</w:t>
+        <w:t xml:space="preserve">courseware/&lt;ID&gt;/ — the matching workshop set (guides and assets) per scenario.</w:t>
       </w:r>
     </w:p>
     <w:p>
@@ -363,7 +621,7 @@
           <w:rFonts w:ascii="Consolas" w:hAnsi="Consolas"/>
           <w:sz w:val="20"/>
         </w:rPr>
-        <w:t xml:space="preserve">make load SCENARIO=CSCU</w:t>
+        <w:t xml:space="preserve">make load SCENARIO=CSCU        # and/or RETAIL, HEALTH, MFG</w:t>
       </w:r>
     </w:p>
     <w:p>
@@ -380,7 +638,7 @@
         </w:numPr>
       </w:pPr>
       <w:r>
-        <w:t xml:space="preserve">creates the scenario's database (cscu_core) and runs its SQL in order — schema, tables, sample data, then the read-only pdc_user grants;</w:t>
+        <w:t xml:space="preserve">creates the scenario's database (e.g. cscu_core) and runs its SQL in order — schema, tables, sample data, then the read-only pdc_user grants;</w:t>
       </w:r>
     </w:p>
     <w:p>
@@ -392,7 +650,7 @@
         </w:numPr>
       </w:pPr>
       <w:r>
-        <w:t xml:space="preserve">creates the scenario's bucket (cscu-documents), its read-only MinIO user and a bucket-scoped read-only policy;</w:t>
+        <w:t xml:space="preserve">creates the scenario's bucket (e.g. cscu-documents), its read-only MinIO user and a bucket-scoped read-only policy;</w:t>
       </w:r>
     </w:p>
     <w:p>
@@ -734,7 +992,7 @@
     </w:p>
     <w:p>
       <w:r>
-        <w:t xml:space="preserve">Always use the VM's IP address (192.168.1.200) for the data-source connections; reserve pentaho.io for PDC's own HTTPS URL. Container names such as demo-postgres resolve only inside the VM's Docker network, and the IP endpoint also forces the S3 path-style addressing that MinIO requires. These are the exact values printed by make console, and the same ones pre-filled in the scenario's bulk-load CSV (data_sources/CSCU/cscu-datasources.csv).</w:t>
+        <w:t xml:space="preserve">Always use the VM's IP address (192.168.1.200) for the data-source connections; reserve pentaho.io for PDC's own HTTPS URL. Container names such as demo-postgres resolve only inside the VM's Docker network, and the IP endpoint also forces the S3 path-style addressing that MinIO requires. These are the exact values printed by make console, and the same ones pre-filled in each scenario's bulk-load CSV (e.g. data_sources/CSCU/cscu-datasources.csv). The tables below show the CSCU scenario as the worked example — the other scenarios follow the same pattern with their own names.</w:t>
       </w:r>
     </w:p>
     <w:p>
@@ -1330,12 +1588,185 @@
         <w:pStyle w:val="Heading2"/>
       </w:pPr>
       <w:r>
-        <w:t xml:space="preserve">Future scenarios — the same pattern</w:t>
-      </w:r>
-    </w:p>
-    <w:p>
-      <w:r>
-        <w:t xml:space="preserve">Any additional scenario dropped under data_sources/&lt;ID&gt;/ (with a scenario.json) connects identically — only the database, bucket and resource names change; the host, port and endpoint stay the same.</w:t>
+        <w:t xml:space="preserve">The other scenarios — the same pattern</w:t>
+      </w:r>
+    </w:p>
+    <w:p>
+      <w:r>
+        <w:t xml:space="preserve">RETAIL, HEALTH and MFG connect identically — only the database, bucket and resource names change; the host, port, endpoint and pdc_user stay the same:</w:t>
+      </w:r>
+    </w:p>
+    <w:tbl>
+      <w:tblPr>
+        <w:tblW w:w="0" w:type="auto"/>
+        <w:tblBorders>
+          <w:top w:val="single" w:sz="4" w:space="0" w:color="BFBFBF"/>
+          <w:left w:val="single" w:sz="4" w:space="0" w:color="BFBFBF"/>
+          <w:bottom w:val="single" w:sz="4" w:space="0" w:color="BFBFBF"/>
+          <w:right w:val="single" w:sz="4" w:space="0" w:color="BFBFBF"/>
+          <w:insideH w:val="single" w:sz="4" w:space="0" w:color="BFBFBF"/>
+          <w:insideV w:val="single" w:sz="4" w:space="0" w:color="BFBFBF"/>
+        </w:tblBorders>
+      </w:tblPr>
+      <w:tblGrid>
+        <w:gridCol w:w="1500"/>
+        <w:gridCol w:w="4030"/>
+        <w:gridCol w:w="3830"/>
+      </w:tblGrid>
+      <w:tr>
+        <w:tc>
+          <w:tcPr>
+            <w:tcW w:w="1500" w:type="dxa"/>
+          </w:tcPr>
+          <w:p>
+            <w:r>
+              <w:rPr>
+                <w:b/>
+              </w:rPr>
+              <w:t xml:space="preserve">Scenario</w:t>
+            </w:r>
+          </w:p>
+        </w:tc>
+        <w:tc>
+          <w:tcPr>
+            <w:tcW w:w="4030" w:type="dxa"/>
+          </w:tcPr>
+          <w:p>
+            <w:r>
+              <w:rPr>
+                <w:b/>
+              </w:rPr>
+              <w:t xml:space="preserve">Database source / database</w:t>
+            </w:r>
+          </w:p>
+        </w:tc>
+        <w:tc>
+          <w:tcPr>
+            <w:tcW w:w="3830" w:type="dxa"/>
+          </w:tcPr>
+          <w:p>
+            <w:r>
+              <w:rPr>
+                <w:b/>
+              </w:rPr>
+              <w:t xml:space="preserve">Object-store source / bucket</w:t>
+            </w:r>
+          </w:p>
+        </w:tc>
+      </w:tr>
+      <w:tr>
+        <w:tc>
+          <w:tcPr>
+            <w:tcW w:w="1500" w:type="dxa"/>
+          </w:tcPr>
+          <w:p>
+            <w:r>
+              <w:t xml:space="preserve">RETAIL</w:t>
+            </w:r>
+          </w:p>
+        </w:tc>
+        <w:tc>
+          <w:tcPr>
+            <w:tcW w:w="4030" w:type="dxa"/>
+          </w:tcPr>
+          <w:p>
+            <w:r>
+              <w:rPr>
+                <w:rFonts w:ascii="Consolas" w:hAnsi="Consolas"/>
+                <w:sz w:val="20"/>
+              </w:rPr>
+              <w:t xml:space="preserve">CanyonTrail_Retail_Ops / cto_retail</w:t>
+            </w:r>
+          </w:p>
+        </w:tc>
+        <w:tc>
+          <w:tcPr>
+            <w:tcW w:w="3830" w:type="dxa"/>
+          </w:tcPr>
+          <w:p>
+            <w:r>
+              <w:t xml:space="preserve">CanyonTrail_Documents / cto-documents</w:t>
+            </w:r>
+          </w:p>
+        </w:tc>
+      </w:tr>
+      <w:tr>
+        <w:tc>
+          <w:tcPr>
+            <w:tcW w:w="1500" w:type="dxa"/>
+          </w:tcPr>
+          <w:p>
+            <w:r>
+              <w:t xml:space="preserve">HEALTH</w:t>
+            </w:r>
+          </w:p>
+        </w:tc>
+        <w:tc>
+          <w:tcPr>
+            <w:tcW w:w="4030" w:type="dxa"/>
+          </w:tcPr>
+          <w:p>
+            <w:r>
+              <w:rPr>
+                <w:rFonts w:ascii="Consolas" w:hAnsi="Consolas"/>
+                <w:sz w:val="20"/>
+              </w:rPr>
+              <w:t xml:space="preserve">Lakeshore_Clinical / lhp_clinical</w:t>
+            </w:r>
+          </w:p>
+        </w:tc>
+        <w:tc>
+          <w:tcPr>
+            <w:tcW w:w="3830" w:type="dxa"/>
+          </w:tcPr>
+          <w:p>
+            <w:r>
+              <w:t xml:space="preserve">Lakeshore_Documents / lhp-documents</w:t>
+            </w:r>
+          </w:p>
+        </w:tc>
+      </w:tr>
+      <w:tr>
+        <w:tc>
+          <w:tcPr>
+            <w:tcW w:w="1500" w:type="dxa"/>
+          </w:tcPr>
+          <w:p>
+            <w:r>
+              <w:t xml:space="preserve">MFG</w:t>
+            </w:r>
+          </w:p>
+        </w:tc>
+        <w:tc>
+          <w:tcPr>
+            <w:tcW w:w="4030" w:type="dxa"/>
+          </w:tcPr>
+          <w:p>
+            <w:r>
+              <w:rPr>
+                <w:rFonts w:ascii="Consolas" w:hAnsi="Consolas"/>
+                <w:sz w:val="20"/>
+              </w:rPr>
+              <w:t xml:space="preserve">Cascade_Manufacturing / cpc_mfg</w:t>
+            </w:r>
+          </w:p>
+        </w:tc>
+        <w:tc>
+          <w:tcPr>
+            <w:tcW w:w="3830" w:type="dxa"/>
+          </w:tcPr>
+          <w:p>
+            <w:r>
+              <w:t xml:space="preserve">Cascade_Documents / cpc-documents</w:t>
+            </w:r>
+          </w:p>
+        </w:tc>
+      </w:tr>
+    </w:tbl>
+    <w:p/>
+    <w:p>
+      <w:r>
+        <w:t xml:space="preserve">Any additional scenario dropped under data_sources/&lt;ID&gt;/ (with a scenario.json) plugs in the same way with no script changes.</w:t>
       </w:r>
     </w:p>
     <w:p>
@@ -1383,8 +1814,227 @@
       </w:r>
     </w:p>
     <w:p>
-      <w:r>
-        <w:t xml:space="preserve">All Copper State Credit Union data is fictional and generated for training. Lab credentials are training values; change them for anything beyond the lab.</w:t>
+      <w:pPr>
+        <w:pStyle w:val="Heading1"/>
+      </w:pPr>
+      <w:r>
+        <w:t xml:space="preserve">Troubleshooting — PDC itself won't come up</w:t>
+      </w:r>
+    </w:p>
+    <w:p>
+      <w:r>
+        <w:t xml:space="preserve">The lab stack and PDC share the VM, so a broken PDC blocks every workshop even when make status is green. The known failure on this deployment is the PDC stack ending its startup with:</w:t>
+      </w:r>
+    </w:p>
+    <w:p>
+      <w:pPr>
+        <w:shd w:val="clear" w:color="auto" w:fill="F2F2F2"/>
+      </w:pPr>
+      <w:r>
+        <w:rPr>
+          <w:rFonts w:ascii="Consolas" w:hAnsi="Consolas"/>
+          <w:sz w:val="20"/>
+        </w:rPr>
+        <w:t xml:space="preserve">service "opensearch-cluster-init" didn't complete successfully: exit 1</w:t>
+      </w:r>
+    </w:p>
+    <w:p>
+      <w:r>
+        <w:t xml:space="preserve">Known cause (cat-opensearch:2.19, fresh volume): the image regenerates the node truststore (extra.crt) with only the node CA, so it does not trust the CN=admin certificate. securityadmin then cannot write the .opendistro_security index and cluster-init times out. Tell-tale: inside the opensearch container, a plain curl to _cluster/health answers "not initialized" instead of a 401. This recurs on every clean rebuild with a fresh OpenSearch volume.</w:t>
+      </w:r>
+    </w:p>
+    <w:p>
+      <w:r>
+        <w:t xml:space="preserve">Fix — append the admin cert to the node truststore, restart, run securityadmin by hand (on the VM, from /opt/pentaho/pdc-docker-deployment):</w:t>
+      </w:r>
+    </w:p>
+    <w:p>
+      <w:pPr>
+        <w:shd w:val="clear" w:color="auto" w:fill="F2F2F2"/>
+      </w:pPr>
+      <w:r>
+        <w:rPr>
+          <w:rFonts w:ascii="Consolas" w:hAnsi="Consolas"/>
+          <w:sz w:val="20"/>
+        </w:rPr>
+        <w:t xml:space="preserve">node=$(docker ps --format '{{.Names}}' | grep opensearch | grep -vE 'init|volume' | head -1)</w:t>
+      </w:r>
+    </w:p>
+    <w:p>
+      <w:pPr>
+        <w:shd w:val="clear" w:color="auto" w:fill="F2F2F2"/>
+      </w:pPr>
+      <w:r>
+        <w:rPr>
+          <w:rFonts w:ascii="Consolas" w:hAnsi="Consolas"/>
+          <w:sz w:val="20"/>
+        </w:rPr>
+        <w:t xml:space="preserve">docker exec -u 0 "$node" sh -c '</w:t>
+      </w:r>
+    </w:p>
+    <w:p>
+      <w:pPr>
+        <w:shd w:val="clear" w:color="auto" w:fill="F2F2F2"/>
+      </w:pPr>
+      <w:r>
+        <w:rPr>
+          <w:rFonts w:ascii="Consolas" w:hAnsi="Consolas"/>
+          <w:sz w:val="20"/>
+        </w:rPr>
+        <w:t xml:space="preserve">  if [ $(grep -c "BEGIN CERT" /opt/bitnami/opensearch/config/extra.crt) -lt 2 ]; then</w:t>
+      </w:r>
+    </w:p>
+    <w:p>
+      <w:pPr>
+        <w:shd w:val="clear" w:color="auto" w:fill="F2F2F2"/>
+      </w:pPr>
+      <w:r>
+        <w:rPr>
+          <w:rFonts w:ascii="Consolas" w:hAnsi="Consolas"/>
+          <w:sz w:val="20"/>
+        </w:rPr>
+        <w:t xml:space="preserve">    cat /opt/bitnami/opensearch/config/admin.crt &gt;&gt; /opt/bitnami/opensearch/config/extra.crt</w:t>
+      </w:r>
+    </w:p>
+    <w:p>
+      <w:pPr>
+        <w:shd w:val="clear" w:color="auto" w:fill="F2F2F2"/>
+      </w:pPr>
+      <w:r>
+        <w:rPr>
+          <w:rFonts w:ascii="Consolas" w:hAnsi="Consolas"/>
+          <w:sz w:val="20"/>
+        </w:rPr>
+        <w:t xml:space="preserve">  fi'</w:t>
+      </w:r>
+    </w:p>
+    <w:p>
+      <w:pPr>
+        <w:shd w:val="clear" w:color="auto" w:fill="F2F2F2"/>
+      </w:pPr>
+      <w:r>
+        <w:rPr>
+          <w:rFonts w:ascii="Consolas" w:hAnsi="Consolas"/>
+          <w:sz w:val="20"/>
+        </w:rPr>
+        <w:t xml:space="preserve">docker restart "$node" &amp;&amp; sleep 40</w:t>
+      </w:r>
+    </w:p>
+    <w:p>
+      <w:pPr>
+        <w:shd w:val="clear" w:color="auto" w:fill="F2F2F2"/>
+      </w:pPr>
+      <w:r>
+        <w:rPr>
+          <w:rFonts w:ascii="Consolas" w:hAnsi="Consolas"/>
+          <w:sz w:val="20"/>
+        </w:rPr>
+        <w:t xml:space="preserve">docker exec "$node" bash -c '</w:t>
+      </w:r>
+    </w:p>
+    <w:p>
+      <w:pPr>
+        <w:shd w:val="clear" w:color="auto" w:fill="F2F2F2"/>
+      </w:pPr>
+      <w:r>
+        <w:rPr>
+          <w:rFonts w:ascii="Consolas" w:hAnsi="Consolas"/>
+          <w:sz w:val="20"/>
+        </w:rPr>
+        <w:t xml:space="preserve">  cd /opt/bitnami/opensearch/plugins/opensearch-security/tools &amp;&amp; \</w:t>
+      </w:r>
+    </w:p>
+    <w:p>
+      <w:pPr>
+        <w:shd w:val="clear" w:color="auto" w:fill="F2F2F2"/>
+      </w:pPr>
+      <w:r>
+        <w:rPr>
+          <w:rFonts w:ascii="Consolas" w:hAnsi="Consolas"/>
+          <w:sz w:val="20"/>
+        </w:rPr>
+        <w:t xml:space="preserve">  ./securityadmin.sh -cd /opt/bitnami/opensearch/config/opensearch-security/ \</w:t>
+      </w:r>
+    </w:p>
+    <w:p>
+      <w:pPr>
+        <w:shd w:val="clear" w:color="auto" w:fill="F2F2F2"/>
+      </w:pPr>
+      <w:r>
+        <w:rPr>
+          <w:rFonts w:ascii="Consolas" w:hAnsi="Consolas"/>
+          <w:sz w:val="20"/>
+        </w:rPr>
+        <w:t xml:space="preserve">    -icl -nhnv -cacert /opt/bitnami/opensearch/config/extra.crt \</w:t>
+      </w:r>
+    </w:p>
+    <w:p>
+      <w:pPr>
+        <w:shd w:val="clear" w:color="auto" w:fill="F2F2F2"/>
+      </w:pPr>
+      <w:r>
+        <w:rPr>
+          <w:rFonts w:ascii="Consolas" w:hAnsi="Consolas"/>
+          <w:sz w:val="20"/>
+        </w:rPr>
+        <w:t xml:space="preserve">    -cert /opt/bitnami/opensearch/config/admin.crt \</w:t>
+      </w:r>
+    </w:p>
+    <w:p>
+      <w:pPr>
+        <w:shd w:val="clear" w:color="auto" w:fill="F2F2F2"/>
+      </w:pPr>
+      <w:r>
+        <w:rPr>
+          <w:rFonts w:ascii="Consolas" w:hAnsi="Consolas"/>
+          <w:sz w:val="20"/>
+        </w:rPr>
+        <w:t xml:space="preserve">    -key /opt/bitnami/opensearch/config/admin.key -h localhost -p 9200'</w:t>
+      </w:r>
+    </w:p>
+    <w:p>
+      <w:r>
+        <w:t xml:space="preserve">Expect "Done with success", then ./pdc.sh up — cluster-init should reach Exited (0). The full diagnostic chain (including the generic causes: vm.max_map_count, memory, disk watermark) is in docs/PDC-VM-TROUBLESHOOTING.md in the repository.</w:t>
+      </w:r>
+    </w:p>
+    <w:p>
+      <w:pPr>
+        <w:pStyle w:val="Heading2"/>
+      </w:pPr>
+      <w:r>
+        <w:t xml:space="preserve">Browser: certificate warning at https://pentaho.io</w:t>
+      </w:r>
+    </w:p>
+    <w:p>
+      <w:r>
+        <w:t xml:space="preserve">After a rebuild, Chrome shows NET::ERR_CERT_AUTHORITY_INVALID for pentaho.io with no Proceed anyway link. This is a browser trust issue, not a PDC failure: PDC's TLS certificate is self-signed and regenerates on every clean rebuild, and pentaho.io is under HSTS, which suppresses Chrome's normal bypass link.</w:t>
+      </w:r>
+    </w:p>
+    <w:p>
+      <w:r>
+        <w:t xml:space="preserve">Fastest (per-cert bypass): with the error page focused, type blind — there is no input box:</w:t>
+      </w:r>
+    </w:p>
+    <w:p>
+      <w:pPr>
+        <w:shd w:val="clear" w:color="auto" w:fill="F2F2F2"/>
+      </w:pPr>
+      <w:r>
+        <w:rPr>
+          <w:rFonts w:ascii="Consolas" w:hAnsi="Consolas"/>
+          <w:sz w:val="20"/>
+        </w:rPr>
+        <w:t xml:space="preserve">thisisunsafe</w:t>
+      </w:r>
+    </w:p>
+    <w:p>
+      <w:r>
+        <w:t xml:space="preserve">Chrome accepts it as the HSTS-override passphrase and loads the site. Repeat after any rebuild that regenerates the certificate. The clean alternative — capturing the cert the proxy actually serves with openssl s_client and importing it into the system and Chrome trust stores — is documented in docs/PDC-VM-TROUBLESHOOTING.md; note it must be re-done after every volume-wipe rebuild, which is why the bypass is pragmatic in a rebuild-heavy lab.</w:t>
+      </w:r>
+    </w:p>
+    <w:p>
+      <w:r>
+        <w:t xml:space="preserve">All scenario data is fictional and generated for training. Lab credentials are training values; change them for anything beyond the lab.</w:t>
       </w:r>
     </w:p>
     <w:sectPr>
@@ -1453,7 +2103,7 @@
         <w:sz w:val="16"/>
         <w:szCs w:val="16"/>
       </w:rPr>
-      <w:t xml:space="preserve">Shared Demo Lab (CSCU)  ·  Page </w:t>
+      <w:t xml:space="preserve">Shared Demo Lab (CSCU · RETAIL · HEALTH · MFG)  ·  Page </w:t>
     </w:r>
     <w:r>
       <w:rPr>

</xml_diff>

<commit_message>
lab-setup.docx Part E: what persists between app runs
New section in the Glossary Generator part: the file-based persistence
model (connections incl. credentials, saved glossaries, tag dictionary,
roster, settings, audit, registries, scenario config - all survive a
restart), the two deliberate exceptions (the unsaved Review grid, which
only persists on Save, and memory-only PDC tokens), and the two related
behaviours (reset-scenario undoes persistence with backups;
install-scenario reseeds tag_dictionary.json - don't re-install over a
hand-curated dictionary casually). Word COM QA OK.

Co-Authored-By: Claude Fable 5 <noreply@anthropic.com>
</commit_message>
<xml_diff>
--- a/data_sources/lab/lab-setup.docx
+++ b/data_sources/lab/lab-setup.docx
@@ -1427,6 +1427,401 @@
       </w:pPr>
       <w:r>
         <w:t xml:space="preserve">Dictionary page — the governed vocabulary has reseeded from the new pack (if you switched scenarios while the app was running, use Reseed).</w:t>
+      </w:r>
+    </w:p>
+    <w:p>
+      <w:pPr>
+        <w:pStyle w:val="Heading2"/>
+      </w:pPr>
+      <w:r>
+        <w:t xml:space="preserve">What persists between runs</w:t>
+      </w:r>
+    </w:p>
+    <w:p>
+      <w:r>
+        <w:t xml:space="preserve">The app is deliberately file-based: all state lives in git-ignored JSON files beside the app code, written as you work and reloaded on the next start. Stopping the app and re-running it loses nothing that has been saved:</w:t>
+      </w:r>
+    </w:p>
+    <w:tbl>
+      <w:tblPr>
+        <w:tblW w:w="0" w:type="auto"/>
+        <w:tblBorders>
+          <w:top w:val="single" w:sz="4" w:space="0" w:color="BFBFBF"/>
+          <w:left w:val="single" w:sz="4" w:space="0" w:color="BFBFBF"/>
+          <w:bottom w:val="single" w:sz="4" w:space="0" w:color="BFBFBF"/>
+          <w:right w:val="single" w:sz="4" w:space="0" w:color="BFBFBF"/>
+          <w:insideH w:val="single" w:sz="4" w:space="0" w:color="BFBFBF"/>
+          <w:insideV w:val="single" w:sz="4" w:space="0" w:color="BFBFBF"/>
+        </w:tblBorders>
+      </w:tblPr>
+      <w:tblGrid>
+        <w:gridCol w:w="2650"/>
+        <w:gridCol w:w="2450"/>
+        <w:gridCol w:w="4260"/>
+      </w:tblGrid>
+      <w:tr>
+        <w:tc>
+          <w:tcPr>
+            <w:tcW w:w="2650" w:type="dxa"/>
+          </w:tcPr>
+          <w:p>
+            <w:r>
+              <w:rPr>
+                <w:b/>
+              </w:rPr>
+              <w:t xml:space="preserve">State</w:t>
+            </w:r>
+          </w:p>
+        </w:tc>
+        <w:tc>
+          <w:tcPr>
+            <w:tcW w:w="2450" w:type="dxa"/>
+          </w:tcPr>
+          <w:p>
+            <w:r>
+              <w:rPr>
+                <w:b/>
+              </w:rPr>
+              <w:t xml:space="preserve">File</w:t>
+            </w:r>
+          </w:p>
+        </w:tc>
+        <w:tc>
+          <w:tcPr>
+            <w:tcW w:w="4260" w:type="dxa"/>
+          </w:tcPr>
+          <w:p>
+            <w:r>
+              <w:rPr>
+                <w:b/>
+              </w:rPr>
+              <w:t xml:space="preserve">Survives a restart?</w:t>
+            </w:r>
+          </w:p>
+        </w:tc>
+      </w:tr>
+      <w:tr>
+        <w:tc>
+          <w:tcPr>
+            <w:tcW w:w="2650" w:type="dxa"/>
+          </w:tcPr>
+          <w:p>
+            <w:r>
+              <w:t xml:space="preserve">Saved connections</w:t>
+            </w:r>
+          </w:p>
+        </w:tc>
+        <w:tc>
+          <w:tcPr>
+            <w:tcW w:w="2450" w:type="dxa"/>
+          </w:tcPr>
+          <w:p>
+            <w:r>
+              <w:rPr>
+                <w:rFonts w:ascii="Consolas" w:hAnsi="Consolas"/>
+                <w:sz w:val="20"/>
+              </w:rPr>
+              <w:t xml:space="preserve">connections.json</w:t>
+            </w:r>
+          </w:p>
+        </w:tc>
+        <w:tc>
+          <w:tcPr>
+            <w:tcW w:w="4260" w:type="dxa"/>
+          </w:tcPr>
+          <w:p>
+            <w:r>
+              <w:t xml:space="preserve">Yes — including credentials; treat a connections export as sensitive</w:t>
+            </w:r>
+          </w:p>
+        </w:tc>
+      </w:tr>
+      <w:tr>
+        <w:tc>
+          <w:tcPr>
+            <w:tcW w:w="2650" w:type="dxa"/>
+          </w:tcPr>
+          <w:p>
+            <w:r>
+              <w:t xml:space="preserve">Saved glossaries (Review rows)</w:t>
+            </w:r>
+          </w:p>
+        </w:tc>
+        <w:tc>
+          <w:tcPr>
+            <w:tcW w:w="2450" w:type="dxa"/>
+          </w:tcPr>
+          <w:p>
+            <w:r>
+              <w:rPr>
+                <w:rFonts w:ascii="Consolas" w:hAnsi="Consolas"/>
+                <w:sz w:val="20"/>
+              </w:rPr>
+              <w:t xml:space="preserve">glossaries.json</w:t>
+            </w:r>
+          </w:p>
+        </w:tc>
+        <w:tc>
+          <w:tcPr>
+            <w:tcW w:w="4260" w:type="dxa"/>
+          </w:tcPr>
+          <w:p>
+            <w:r>
+              <w:t xml:space="preserve">Yes — every named Save, with its timestamp</w:t>
+            </w:r>
+          </w:p>
+        </w:tc>
+      </w:tr>
+      <w:tr>
+        <w:tc>
+          <w:tcPr>
+            <w:tcW w:w="2650" w:type="dxa"/>
+          </w:tcPr>
+          <w:p>
+            <w:r>
+              <w:t xml:space="preserve">Term &amp; Tag dictionary</w:t>
+            </w:r>
+          </w:p>
+        </w:tc>
+        <w:tc>
+          <w:tcPr>
+            <w:tcW w:w="2450" w:type="dxa"/>
+          </w:tcPr>
+          <w:p>
+            <w:r>
+              <w:rPr>
+                <w:rFonts w:ascii="Consolas" w:hAnsi="Consolas"/>
+                <w:sz w:val="20"/>
+              </w:rPr>
+              <w:t xml:space="preserve">tag_dictionary.json</w:t>
+            </w:r>
+          </w:p>
+        </w:tc>
+        <w:tc>
+          <w:tcPr>
+            <w:tcW w:w="4260" w:type="dxa"/>
+          </w:tcPr>
+          <w:p>
+            <w:r>
+              <w:t xml:space="preserve">Yes — seeded once from the pack, then persisted; edits and approvals accumulate</w:t>
+            </w:r>
+          </w:p>
+        </w:tc>
+      </w:tr>
+      <w:tr>
+        <w:tc>
+          <w:tcPr>
+            <w:tcW w:w="2650" w:type="dxa"/>
+          </w:tcPr>
+          <w:p>
+            <w:r>
+              <w:t xml:space="preserve">Steward roster</w:t>
+            </w:r>
+          </w:p>
+        </w:tc>
+        <w:tc>
+          <w:tcPr>
+            <w:tcW w:w="2450" w:type="dxa"/>
+          </w:tcPr>
+          <w:p>
+            <w:r>
+              <w:rPr>
+                <w:rFonts w:ascii="Consolas" w:hAnsi="Consolas"/>
+                <w:sz w:val="20"/>
+              </w:rPr>
+              <w:t xml:space="preserve">people.json</w:t>
+            </w:r>
+          </w:p>
+        </w:tc>
+        <w:tc>
+          <w:tcPr>
+            <w:tcW w:w="4260" w:type="dxa"/>
+          </w:tcPr>
+          <w:p>
+            <w:r>
+              <w:t xml:space="preserve">Yes</w:t>
+            </w:r>
+          </w:p>
+        </w:tc>
+      </w:tr>
+      <w:tr>
+        <w:tc>
+          <w:tcPr>
+            <w:tcW w:w="2650" w:type="dxa"/>
+          </w:tcPr>
+          <w:p>
+            <w:r>
+              <w:t xml:space="preserve">Settings</w:t>
+            </w:r>
+          </w:p>
+        </w:tc>
+        <w:tc>
+          <w:tcPr>
+            <w:tcW w:w="2450" w:type="dxa"/>
+          </w:tcPr>
+          <w:p>
+            <w:r>
+              <w:rPr>
+                <w:rFonts w:ascii="Consolas" w:hAnsi="Consolas"/>
+                <w:sz w:val="20"/>
+              </w:rPr>
+              <w:t xml:space="preserve">settings.json</w:t>
+            </w:r>
+          </w:p>
+        </w:tc>
+        <w:tc>
+          <w:tcPr>
+            <w:tcW w:w="4260" w:type="dxa"/>
+          </w:tcPr>
+          <w:p>
+            <w:r>
+              <w:t xml:space="preserve">Yes</w:t>
+            </w:r>
+          </w:p>
+        </w:tc>
+      </w:tr>
+      <w:tr>
+        <w:tc>
+          <w:tcPr>
+            <w:tcW w:w="2650" w:type="dxa"/>
+          </w:tcPr>
+          <w:p>
+            <w:r>
+              <w:t xml:space="preserve">Audit trail</w:t>
+            </w:r>
+          </w:p>
+        </w:tc>
+        <w:tc>
+          <w:tcPr>
+            <w:tcW w:w="2450" w:type="dxa"/>
+          </w:tcPr>
+          <w:p>
+            <w:r>
+              <w:rPr>
+                <w:rFonts w:ascii="Consolas" w:hAnsi="Consolas"/>
+                <w:sz w:val="20"/>
+              </w:rPr>
+              <w:t xml:space="preserve">audit_log.json</w:t>
+            </w:r>
+          </w:p>
+        </w:tc>
+        <w:tc>
+          <w:tcPr>
+            <w:tcW w:w="4260" w:type="dxa"/>
+          </w:tcPr>
+          <w:p>
+            <w:r>
+              <w:t xml:space="preserve">Yes</w:t>
+            </w:r>
+          </w:p>
+        </w:tc>
+      </w:tr>
+      <w:tr>
+        <w:tc>
+          <w:tcPr>
+            <w:tcW w:w="2650" w:type="dxa"/>
+          </w:tcPr>
+          <w:p>
+            <w:r>
+              <w:t xml:space="preserve">Exported Registries</w:t>
+            </w:r>
+          </w:p>
+        </w:tc>
+        <w:tc>
+          <w:tcPr>
+            <w:tcW w:w="2450" w:type="dxa"/>
+          </w:tcPr>
+          <w:p>
+            <w:r>
+              <w:rPr>
+                <w:rFonts w:ascii="Consolas" w:hAnsi="Consolas"/>
+                <w:sz w:val="20"/>
+              </w:rPr>
+              <w:t xml:space="preserve">registries/</w:t>
+            </w:r>
+          </w:p>
+        </w:tc>
+        <w:tc>
+          <w:tcPr>
+            <w:tcW w:w="4260" w:type="dxa"/>
+          </w:tcPr>
+          <w:p>
+            <w:r>
+              <w:t xml:space="preserve">Yes — one registry per exported glossary</w:t>
+            </w:r>
+          </w:p>
+        </w:tc>
+      </w:tr>
+      <w:tr>
+        <w:tc>
+          <w:tcPr>
+            <w:tcW w:w="2650" w:type="dxa"/>
+          </w:tcPr>
+          <w:p>
+            <w:r>
+              <w:t xml:space="preserve">Scenario config</w:t>
+            </w:r>
+          </w:p>
+        </w:tc>
+        <w:tc>
+          <w:tcPr>
+            <w:tcW w:w="2450" w:type="dxa"/>
+          </w:tcPr>
+          <w:p>
+            <w:r>
+              <w:rPr>
+                <w:rFonts w:ascii="Consolas" w:hAnsi="Consolas"/>
+                <w:sz w:val="20"/>
+              </w:rPr>
+              <w:t xml:space="preserve">domain_pack.json, .env</w:t>
+            </w:r>
+          </w:p>
+        </w:tc>
+        <w:tc>
+          <w:tcPr>
+            <w:tcW w:w="4260" w:type="dxa"/>
+          </w:tcPr>
+          <w:p>
+            <w:r>
+              <w:t xml:space="preserve">Yes</w:t>
+            </w:r>
+          </w:p>
+        </w:tc>
+      </w:tr>
+    </w:tbl>
+    <w:p/>
+    <w:p>
+      <w:r>
+        <w:t xml:space="preserve">Two things do NOT persist, both deliberate:</w:t>
+      </w:r>
+    </w:p>
+    <w:p>
+      <w:pPr>
+        <w:pStyle w:val="ListParagraph"/>
+        <w:numPr>
+          <w:ilvl w:val="0"/>
+          <w:numId w:val="2"/>
+        </w:numPr>
+      </w:pPr>
+      <w:r>
+        <w:t xml:space="preserve">The in-progress Review grid lives in the browser session; the server only holds it once you click Save (that is what writes glossaries.json). Save the glossary before closing the app or the tab — unsaved edits are the one thing you can lose.</w:t>
+      </w:r>
+    </w:p>
+    <w:p>
+      <w:pPr>
+        <w:pStyle w:val="ListParagraph"/>
+        <w:numPr>
+          <w:ilvl w:val="0"/>
+          <w:numId w:val="2"/>
+        </w:numPr>
+      </w:pPr>
+      <w:r>
+        <w:t xml:space="preserve">PDC bearer tokens are held in memory only, never written to disk — you re-authenticate (Get token) each session.</w:t>
+      </w:r>
+    </w:p>
+    <w:p>
+      <w:r>
+        <w:t xml:space="preserve">Two related behaviours: reset-scenario exists precisely to undo this persistence (default clears the scenario files; --all also wipes connections, settings, glossaries, audit and registries — always leaving .backup-&lt;timestamp&gt; copies). And rerunning install-scenario removes tag_dictionary.json (backed up) to force a reseed from the new pack — so do not casually re-install over a dictionary you have hand-curated; the backup makes it recoverable, but the live dictionary starts fresh.</w:t>
       </w:r>
     </w:p>
     <w:p>

</xml_diff>

<commit_message>
lab-setup Part E: reaching the host's GPU Ollama from the VM
New subsection: from inside the VM, localhost:11434 is the VM's own CPU
Ollama - point Settings at the Windows host's LAN IP instead. Covers
the two one-time host steps (OLLAMA_HOST=0.0.0.0 + tray restart; scoped
firewall rule for the VM), the adapter trap (use the bridged-LAN
adapter, not VMware's VMnet1/VMnet8 host-only addresses, which time
out), the curl /api/tags verification, and the 60-120s TIMEOUT bump for
cold model loads. Word COM QA OK.

Co-Authored-By: Claude Fable 5 <noreply@anthropic.com>
</commit_message>
<xml_diff>
--- a/data_sources/lab/lab-setup.docx
+++ b/data_sources/lab/lab-setup.docx
@@ -1395,6 +1395,77 @@
     <w:p>
       <w:r>
         <w:t xml:space="preserve">The launcher pre-flights Python, the app files, port 5000 and Ollama, creates a virtualenv and installs dependencies on first run. Ollama is optional: when reachable on 127.0.0.1:11434 (the standard host runs qwen2.5:14b-instruct on local GPUs) the app can LLM-enrich definitions; without it, heuristic definitions remain — fully offline-safe.</w:t>
+      </w:r>
+    </w:p>
+    <w:p>
+      <w:pPr>
+        <w:pStyle w:val="Heading2"/>
+      </w:pPr>
+      <w:r>
+        <w:t xml:space="preserve">Running the app on the VM but Ollama on the Windows host?</w:t>
+      </w:r>
+    </w:p>
+    <w:p>
+      <w:r>
+        <w:t xml:space="preserve">From inside the VM, localhost:11434 is the VM's own (CPU) Ollama, not the host's GPUs. Point the app's Settings -&gt; OLLAMA URL at the Windows host's LAN IP instead — after two one-time steps on the host, because Ollama binds to loopback by default:</w:t>
+      </w:r>
+    </w:p>
+    <w:p>
+      <w:pPr>
+        <w:shd w:val="clear" w:color="auto" w:fill="F2F2F2"/>
+      </w:pPr>
+      <w:r>
+        <w:rPr>
+          <w:rFonts w:ascii="Consolas" w:hAnsi="Consolas"/>
+          <w:sz w:val="20"/>
+        </w:rPr>
+        <w:t xml:space="preserve">setx OLLAMA_HOST 0.0.0.0     # then quit + restart Ollama from the tray</w:t>
+      </w:r>
+    </w:p>
+    <w:p>
+      <w:pPr>
+        <w:shd w:val="clear" w:color="auto" w:fill="F2F2F2"/>
+      </w:pPr>
+      <w:r>
+        <w:rPr>
+          <w:rFonts w:ascii="Consolas" w:hAnsi="Consolas"/>
+          <w:sz w:val="20"/>
+        </w:rPr>
+        <w:t xml:space="preserve">New-NetFirewallRule -DisplayName "Ollama (lab VM)" -Direction Inbound `</w:t>
+      </w:r>
+    </w:p>
+    <w:p>
+      <w:pPr>
+        <w:shd w:val="clear" w:color="auto" w:fill="F2F2F2"/>
+      </w:pPr>
+      <w:r>
+        <w:rPr>
+          <w:rFonts w:ascii="Consolas" w:hAnsi="Consolas"/>
+          <w:sz w:val="20"/>
+        </w:rPr>
+        <w:t xml:space="preserve">  -Protocol TCP -LocalPort 11434 -RemoteAddress 192.168.1.200 -Action Allow</w:t>
+      </w:r>
+    </w:p>
+    <w:p>
+      <w:r>
+        <w:t xml:space="preserve">Pick the RIGHT host IP: use the adapter on the same LAN segment as the bridged VM (e.g. Ethernet, 192.168.1.x) — NOT a VMware VMnet1/VMnet8 host-only address (192.168.32.x / 192.168.187.x), which the bridged VM cannot reach and which times out. ipconfig on the host shows which adapters are live.</w:t>
+      </w:r>
+    </w:p>
+    <w:p>
+      <w:r>
+        <w:t xml:space="preserve">Verify from the VM (should list the pulled models), then set the URL in Settings and Test connection — no re-pull needed, the models stay on the host. Bump the Settings TIMEOUT to 60-120s: a cold model load can exceed the 30s default and makes first calls fail silently.</w:t>
+      </w:r>
+    </w:p>
+    <w:p>
+      <w:pPr>
+        <w:shd w:val="clear" w:color="auto" w:fill="F2F2F2"/>
+      </w:pPr>
+      <w:r>
+        <w:rPr>
+          <w:rFonts w:ascii="Consolas" w:hAnsi="Consolas"/>
+          <w:sz w:val="20"/>
+        </w:rPr>
+        <w:t xml:space="preserve">curl http://&lt;host-ip&gt;:11434/api/tags</w:t>
       </w:r>
     </w:p>
     <w:p>

</xml_diff>

<commit_message>
lab-setup Part E: "Keeping the app up to date" subsection
The VM checkout (~/PDC-Demo) served stale app code for hours while
fixes landed on GitHub - nothing documented the update path. Part E now
covers: version-pill vs CHANGELOG check, git pull + restart commands
(VM + Windows), the Ctrl+F5 page-cache trap, why pulling never touches
state files, and the two-checkouts gotcha. Word-COM verified.

Co-Authored-By: Claude Fable 5 <noreply@anthropic.com>
</commit_message>
<xml_diff>
--- a/data_sources/lab/lab-setup.docx
+++ b/data_sources/lab/lab-setup.docx
@@ -1395,6 +1395,61 @@
     <w:p>
       <w:r>
         <w:t xml:space="preserve">The launcher pre-flights Python, the app files, port 5000 and Ollama, creates a virtualenv and installs dependencies on first run. Ollama is optional: when reachable on 127.0.0.1:11434 (the standard host runs qwen2.5:14b-instruct on local GPUs) the app can LLM-enrich definitions; without it, heuristic definitions remain — fully offline-safe.</w:t>
+      </w:r>
+    </w:p>
+    <w:p>
+      <w:pPr>
+        <w:pStyle w:val="Heading2"/>
+      </w:pPr>
+      <w:r>
+        <w:t xml:space="preserve">Keeping the app up to date (git pull + restart)</w:t>
+      </w:r>
+    </w:p>
+    <w:p>
+      <w:r>
+        <w:t xml:space="preserve">The app evolves continuously in the GitHub repo; a checkout never updates itself. If a documented feature or fix isn't visible, first compare the version pill in the app's sidebar (e.g. v1.8.4) against the newest entry in docs/CHANGELOG.md — if the pill is older, the checkout serving your browser is behind. Update it:</w:t>
+      </w:r>
+    </w:p>
+    <w:p>
+      <w:pPr>
+        <w:shd w:val="clear" w:color="auto" w:fill="F2F2F2"/>
+      </w:pPr>
+      <w:r>
+        <w:rPr>
+          <w:rFonts w:ascii="Consolas" w:hAnsi="Consolas"/>
+          <w:sz w:val="20"/>
+        </w:rPr>
+        <w:t xml:space="preserve">cd ~/PDC-Demo &amp;&amp; git pull            # on the VM  (Windows host: git pull in the repo)</w:t>
+      </w:r>
+    </w:p>
+    <w:p>
+      <w:pPr>
+        <w:shd w:val="clear" w:color="auto" w:fill="F2F2F2"/>
+      </w:pPr>
+      <w:r>
+        <w:rPr>
+          <w:rFonts w:ascii="Consolas" w:hAnsi="Consolas"/>
+          <w:sz w:val="20"/>
+        </w:rPr>
+        <w:t xml:space="preserve">pkill -f 'python.*app.py' 2&gt;/dev/null # stop the running app (or Ctrl+C its terminal)</w:t>
+      </w:r>
+    </w:p>
+    <w:p>
+      <w:pPr>
+        <w:shd w:val="clear" w:color="auto" w:fill="F2F2F2"/>
+      </w:pPr>
+      <w:r>
+        <w:rPr>
+          <w:rFonts w:ascii="Consolas" w:hAnsi="Consolas"/>
+          <w:sz w:val="20"/>
+        </w:rPr>
+        <w:t xml:space="preserve">cd glossary_generator &amp;&amp; ./run.sh     # relaunch (Windows: .
+un.ps1)</w:t>
+      </w:r>
+    </w:p>
+    <w:p>
+      <w:r>
+        <w:t xml:space="preserve">Then hard-refresh the browser (Ctrl+F5) — the page HTML caches, so a plain reload can keep showing the old UI. Updating is always safe for your work: every state file (connections, saved glossaries, dictionary, roster, settings, audit) is git-ignored, so git pull never touches it, and the dictionary self-heals its format on upgrade. Watch out for having TWO checkouts (Windows host and VM) — features land where you pull, and the browser only sees the checkout whose app it is talking to.</w:t>
       </w:r>
     </w:p>
     <w:p>

</xml_diff>